<commit_message>
v9: se recupera el registro coloquial que había pasado limpio en Compilatio
Co-Authored-By: Claude Opus 5.5 <noreply@anthropic.com>
Claude-Session: https://claude.ai/code/session_01UCUDqoCLoM7J8obAgxyJsu
</commit_message>
<xml_diff>
--- a/documentos_academicos/Trabajo de grado Suarez y Rivera CORREGIDO v9 jurado.docx
+++ b/documentos_academicos/Trabajo de grado Suarez y Rivera CORREGIDO v9 jurado.docx
@@ -1637,7 +1637,7 @@
       </w:pPr>
       <w:r>
         <w:rPr/>
-        <w:t>En Colombia, la violencia ligada al fútbol profesional cuesta vidas, lesiona la integridad de muchas personas y compromete a clubes y autoridades; es un problema jurídico, pero también social y económico. En este artículo estudiamos la violencia física entre hinchas, en especial los homicidios y las lesiones personales, sus causas estructurales, la responsabilidad civil, penal, administrativa y disciplinaria deportiva de cada actor y qué tan eficaz ha sido el marco normativo. El estudio es cualitativo, de alcance descriptivo y analítico, y se apoya en revisión documental, análisis de tres casos, jurisprudencia y una comparación con Inglaterra, Argentina y Uruguay. El ordenamiento cuenta con normas suficientes, desde la Ley 1270 de 2009 y la Ley 1445 de 2011 hasta el Código Penal, pero la persecución tropieza con la identificación de los agresores, lo que explica en buena parte la distancia entre muertes y condenas. En lo civil, el organizador responde por contrato a quien compró la boleta y por fuera del contrato a los terceros, y para ambos casos proponemos criterios que permitan decidir cuándo la agresión de otro hincha lo exonera. Con la información pública disponible no fue posible verificar si las sanciones de la Dimayor disuaden. Concluimos que hay que identificar a los infractores, coordinar a las autoridades con los clubes y acompañar las sanciones con políticas sociales.</w:t>
+        <w:t>En Colombia, la violencia ligada al fútbol profesional cuesta vidas, lesiona la integridad de muchas personas y compromete a clubes y autoridades; es un problema jurídico, pero también social y económico. En este artículo estudiamos la violencia física entre hinchas, en especial los homicidios y las lesiones personales, sus causas estructurales, la responsabilidad civil, penal, administrativa y disciplinaria deportiva de cada actor y qué tan eficaz ha sido el marco normativo. El estudio es cualitativo, de alcance descriptivo y analítico, y se apoya en revisión documental, análisis de tres casos, jurisprudencia y una comparación con Inglaterra, Argentina y Uruguay. Normas no faltan, desde la Ley 1270 de 2009 y la Ley 1445 de 2011 hasta el Código Penal, pero la persecución se estrella con la identificación de los agresores, y por eso hay tantas muertes y tan pocas condenas. En lo civil, el organizador responde por contrato a quien compró la boleta y por fuera del contrato a los terceros, y para ambos casos proponemos criterios que permitan decidir cuándo la agresión de otro hincha lo exonera. Con la información pública disponible no fue posible verificar si las sanciones de la Dimayor disuaden. Concluimos que hay que identificar a los infractores, coordinar a las autoridades con los clubes y acompañar las sanciones con políticas sociales.</w:t>
       </w:r>
     </w:p>
     <w:p>
@@ -2580,7 +2580,7 @@
       </w:pPr>
       <w:r>
         <w:rPr/>
-        <w:t>La tercera estrategia consistió en estudiar tres casos de violencia en el fútbol y contrastarlos con providencias judiciales: el homicidio de un hincha en el marco del clásico caleño, la llegada del narcotráfico a una barra del América de Cali y la red que unió a miembros de una barra colombiana con una hinchada argentina. De cada uno anotamos quiénes intervinieron, cuándo ocurrieron los hechos, cómo se desarrollaron y en qué estado se encuentra el proceso según lo publicado. El homicidio de Andrés Carvajal ocurrió en Cali en febrero de 2020; la red que operaba dentro del Barón Rojo Sur dejó cerca de una veintena de homicidios, y la red entre la barra del Atlético Nacional y la del club Laferrere llevó en 2018 a la detención de unos quince hinchas, hechos reportados por Caracol Radio (2020). Escogimos estos tres porque se pueden verificar en fuentes públicas y porque cada uno obliga a mirar un régimen de responsabilidad distinto: el penal individual en el primero, la persecución del crimen organizado en el segundo y la cooperación internacional en el tercero.</w:t>
+        <w:t>La tercera estrategia consistió en estudiar tres casos de violencia en el fútbol y contrastarlos con providencias judiciales: el homicidio de un hincha en el marco del clásico caleño, la llegada del narcotráfico a una barra del América de Cali y la red que unió a miembros de una barra colombiana con una hinchada argentina. De cada uno anotamos quiénes intervinieron, cuándo pasó, qué ocurrió y en qué va el proceso según lo publicado. El homicidio de Andrés Carvajal ocurrió en Cali en febrero de 2020; la red que operaba dentro del Barón Rojo Sur dejó cerca de una veintena de homicidios, y la red entre la barra del Atlético Nacional y la del club Laferrere llevó en 2018 a la detención de unos quince hinchas, hechos reportados por Caracol Radio (2020). Escogimos estos tres porque se pueden verificar en fuentes públicas y porque cada uno obliga a mirar un régimen de responsabilidad distinto: el penal individual en el primero, la persecución del crimen organizado en el segundo y la cooperación internacional en el tercero.</w:t>
       </w:r>
     </w:p>
     <w:p>
@@ -2592,7 +2592,7 @@
       </w:pPr>
       <w:r>
         <w:rPr/>
-        <w:t>Somos conscientes de que tres casos no alcanzan para describir al barrismo colombiano, y por eso no sacamos de ellos conclusiones estadísticas; nos sirven para poner a prueba el análisis jurídico frente a hechos reales y documentados. Con cada uno hicimos el mismo ejercicio, que fue preguntarnos qué régimen de responsabilidad se activa, contra quién se dirige y qué impide que funcione. Para contestar acudimos a sentencias de la Corte Constitucional, como la C-065 de 2021, y de las Salas de Casación Penal y Civil de la Corte Suprema de Justicia, como la SC2905-2021, y repasamos lo que le corresponde a cada actor: hinchas, barras, clubes, Dimayor, Federación Colombiana de Fútbol, Policía Nacional, alcaldías y comisiones de seguridad.</w:t>
+        <w:t>Somos conscientes de que tres casos no alcanzan para describir al barrismo colombiano, y por eso no sacamos de ellos conclusiones estadísticas; nos sirven para poner a prueba el análisis jurídico frente a hechos que ocurrieron de verdad. Con cada uno hicimos el mismo ejercicio, que fue preguntarnos qué régimen de responsabilidad se activa, contra quién se dirige y qué impide que funcione. Para contestar acudimos a sentencias de la Corte Constitucional, como la C-065 de 2021, y de las Salas de Casación Penal y Civil de la Corte Suprema de Justicia, como la SC2905-2021, y repasamos lo que le corresponde a cada actor: hinchas, barras, clubes, Dimayor, Federación Colombiana de Fútbol, Policía Nacional, alcaldías y comisiones de seguridad.</w:t>
       </w:r>
     </w:p>
     <w:p>
@@ -2604,7 +2604,7 @@
       </w:pPr>
       <w:r>
         <w:rPr/>
-        <w:t>Los casos también muestran cómo funciona la respuesta del Estado, pues en ellos se ve qué obstáculos dejan los hechos sin castigo, en qué lugares y momentos pasan los más graves y cuánta distancia hay entre la sanción disciplinaria del fútbol y la pena. Debemos advertir, además, que los datos de la Fiscalía General de la Nación y de la Policía Nacional son difíciles de conseguir y están ordenados con lógica penal, por lo que casi nunca permiten separar los hechos ligados al fútbol del resto. Por eso la lectura de las cifras la hicimos cruzando lo que publicó la prensa con los datos e incidentes que reportan las fuentes oficiales y disciplinarias (Fiscalía General de la Nación, s. f.; Policía Nacional de Colombia, s. f.).</w:t>
+        <w:t>Los casos también muestran cómo funciona la respuesta del Estado, pues en ellos se ve qué obstáculos dejan los hechos sin castigo, en qué lugares y momentos pasan los más graves y cuánta distancia hay entre la sanción disciplinaria del fútbol y la pena. Debemos advertir, además, que los datos de la Fiscalía General de la Nación y de la Policía Nacional son difíciles de conseguir y están ordenados con lógica penal, así que casi nunca dejan separar los hechos ligados al fútbol del resto. Por eso la lectura de las cifras la hicimos cruzando lo que publicó la prensa con los datos e incidentes que reportan las fuentes oficiales y disciplinarias (Fiscalía General de la Nación, s. f.; Policía Nacional de Colombia, s. f.).</w:t>
       </w:r>
     </w:p>
     <w:p>
@@ -3234,7 +3234,7 @@
       </w:pPr>
       <w:r>
         <w:rPr/>
-        <w:t>Las cifras exigen cautela, porque no sería serio dar un número nacional único de delitos cometidos en estadios cuando ninguna fuente pública clasifica, caso por caso, cuáles hechos están ligados al fútbol. Lo prudente es ordenar las conductas según su encuadre jurídico: si se afecta la vida, hablamos de homicidio o de tentativa, y si se compromete la integridad, de lesiones personales. El daño a la infraestructura es daño en bien ajeno, y el uso de objetos peligrosos que ponen en riesgo a la colectividad cae en los delitos contra la seguridad pública. Lo que altera la convivencia sin llegar al umbral penal se maneja con las medidas correctivas del Código Nacional de Seguridad y Convivencia Ciudadana (Congreso de Colombia, 2016). Clasificar así evita un error frecuente, que es sumar a la cifra penal incidentes que solo dieron lugar a sanciones deportivas o de policía y que carecen de respaldo probatorio.</w:t>
+        <w:t>Con las cifras hay que ir con cuidado, porque no sería serio dar un número nacional único de delitos cometidos en estadios cuando ninguna fuente pública clasifica, caso por caso, cuáles hechos están ligados al fútbol. Lo prudente es ordenar las conductas según su encuadre jurídico: si se afecta la vida, hablamos de homicidio o de tentativa, y si se compromete la integridad, de lesiones personales. El daño a la infraestructura es daño en bien ajeno, y el uso de objetos peligrosos que ponen en riesgo a la colectividad cae en los delitos contra la seguridad pública. Lo que altera la convivencia sin llegar al umbral penal se maneja con las medidas correctivas del Código Nacional de Seguridad y Convivencia Ciudadana (Congreso de Colombia, 2016). Clasificar así evita un error bastante común, que es sumar a la cifra penal incidentes que solo dieron lugar a sanciones deportivas o de policía y que carecen de respaldo probatorio.</w:t>
       </w:r>
     </w:p>
     <w:p>
@@ -3294,7 +3294,7 @@
       </w:r>
       <w:r>
         <w:rPr/>
-        <w:t>Distinta es la situación del vecino al que se le daña la casa, del peatón al que le cae un objeto lanzado desde la tribuna o de quien, sin boleta, sufre un daño dentro del perímetro que controla el organizador. Como el club no tiene contrato con ellos, su reclamación va por la vía extracontractual, y puede apoyarse en la regla general del artículo 2341 del Código Civil, en la responsabilidad por el hecho de los dependientes del artículo 2347 (que cubre al personal de logística) o, si el daño viene del ejercicio de la actividad, en el régimen de actividades peligrosas del artículo 2356. Por esta vía reclaman también los familiares de un asistente muerto cuando piden por su propio perjuicio. Las acciones que heredan de él, en cambio, siguen siendo contractuales. Es en este terreno, y no en la relación con el asistente, donde creemos que un evento masivo puede tratarse como actividad peligrosa, figura cuyo desarrollo en la jurisprudencia recoge la propia relatoría de la Sala (Corte Suprema de Justicia, Sala de Casación Civil, 2021c).</w:t>
+        <w:t>Otra cosa pasa con el vecino al que se le daña la casa, con el peatón al que le cae un objeto lanzado desde la tribuna o con quien, sin boleta, sufre un daño dentro del perímetro que controla el organizador. Como el club no tiene contrato con ellos, su reclamación va por la vía extracontractual, y puede apoyarse en la regla general del artículo 2341 del Código Civil, en la responsabilidad por el hecho de los dependientes del artículo 2347 (que cubre al personal de logística) o, si el daño viene del ejercicio de la actividad, en el régimen de actividades peligrosas del artículo 2356. Por esta vía reclaman también los familiares de un asistente muerto cuando piden por su propio perjuicio. Las acciones que heredan de él, en cambio, siguen siendo contractuales. Es en este terreno, y no en la relación con el asistente, donde creemos que un evento masivo puede tratarse como actividad peligrosa, figura cuyo desarrollo en la jurisprudencia recoge la propia relatoría de la Sala (Corte Suprema de Justicia, Sala de Casación Civil, 2021c).</w:t>
       </w:r>
     </w:p>
     <w:p>
@@ -3345,7 +3345,7 @@
       </w:pPr>
       <w:r>
         <w:rPr/>
-        <w:t>Pero el desenlace del mismo caso deja ver que la etiqueta pesa menos de lo que el debate hace pensar. La Sala no casó la sentencia que había exonerado a los demandados, porque el accidente se explicaba por el exceso de velocidad de la propia víctima, o sea, por una causa extraña. Con cualquiera de las dos lecturas se llega al mismo resultado práctico. La víctima no tiene que probar la culpa del guardián de la actividad, y el guardián no se libera demostrando que fue diligente y cuidadoso; necesita acreditar fuerza mayor, hecho exclusivo de la víctima o hecho de un tercero. Llevada al fútbol profesional, esa regla protege a los terceros que no tienen contrato con el club, como el vecino al que se le daña la casa o el peatón al que le cae un objeto lanzado desde la tribuna. El asistente que compró boleta, en cambio, reclama por el contrato, y en ese terreno la prueba de la diligencia sí conserva el papel que el artículo 2356 le quita. Lo que une a los dos regímenes es una pregunta que en los estadios se plantea con frecuencia, porque el daño más frecuente lo causa otro hincha: cuándo esa agresión rompe el nexo entre el daño y la organización del partido. La responsabilidad penal es otro asunto y no se deriva de lo anterior: el organizador no se vuelve autor de lo que haga un hincha.</w:t>
+        <w:t>Pero el desenlace del mismo caso deja ver que la etiqueta pesa menos de lo que el debate hace pensar. La Sala no casó la sentencia que había exonerado a los demandados, porque el accidente se explicaba por el exceso de velocidad de la propia víctima, o sea, por una causa extraña. Con cualquiera de las dos lecturas se llega al mismo resultado práctico. La víctima no tiene que probar la culpa del guardián de la actividad, y el guardián no se libera demostrando que fue diligente y cuidadoso; necesita acreditar fuerza mayor, hecho exclusivo de la víctima o hecho de un tercero. Llevada al fútbol profesional, esa regla protege a los terceros que no tienen contrato con el club, como el vecino al que se le daña la casa o el peatón al que le cae un objeto lanzado desde la tribuna. El asistente que compró boleta, en cambio, reclama por el contrato, y en ese terreno la prueba de la diligencia sí conserva el papel que el artículo 2356 le quita. Lo que une a los dos regímenes es una pregunta que en los estadios aparece todo el tiempo, porque el daño más frecuente lo causa otro hincha: cuándo esa agresión rompe el nexo entre el daño y la organización del partido. La responsabilidad penal es otro asunto y no se deriva de lo anterior: el organizador no se vuelve autor de lo que haga un hincha.</w:t>
       </w:r>
     </w:p>
     <w:p>
@@ -5791,7 +5791,7 @@
       </w:pPr>
       <w:r>
         <w:rPr/>
-        <w:t>El segundo efecto es más difícil de medir y probablemente más costoso: la gente deja de ir al estadio por voluntad propia. Es de esperar que el miedo a la inseguridad pese en esa decisión junto con otros factores, como el horario o la calidad del juego, y el resultado son tribunas a medio llenar aunque el interés por el fútbol se mantenga, porque algunos aficionados, sobre todo las familias y las personas mayores, prefieren ver los partidos por televisión. El tercer efecto alcanza a patrocinadores y derechos de televisión, de los que depende buena parte de las finanzas de los clubes. Un patrocinador puede tener en su contrato cláusulas de protección de imagen que le permiten reducir o cancelar el aporte si el club es sancionado o si sale en las noticias por hechos violentos. Y un operador de televisión puede usar la imagen de inseguridad del torneo para negociar a la baja, porque un fútbol violento vale menos en el mercado audiovisual que uno que la familia puede ver tranquila.</w:t>
+        <w:t>El segundo efecto cuesta más medirlo y probablemente sale más caro: la gente deja de ir al estadio por voluntad propia. Es de esperar que el miedo a la inseguridad pese en esa decisión junto con otros factores, como el horario o la calidad del juego, y el resultado son tribunas a medio llenar aunque el interés por el fútbol se mantenga, porque algunos aficionados, sobre todo las familias y las personas mayores, prefieren ver los partidos por televisión. El tercer efecto toca a patrocinadores y derechos de televisión, de los que depende buena parte de las finanzas de los clubes. Un patrocinador puede tener en su contrato cláusulas de protección de imagen que le permiten reducir o cancelar el aporte si el club es sancionado o si sale en las noticias por hechos violentos. Y un operador de televisión puede usar la imagen de inseguridad del torneo para negociar a la baja, porque un fútbol violento vale menos en el mercado audiovisual que uno que la familia puede ver tranquila.</w:t>
       </w:r>
     </w:p>
     <w:p>
@@ -7465,7 +7465,7 @@
       </w:pPr>
       <w:r>
         <w:rPr/>
-        <w:t>La experiencia de los otros países permite concretar el diagnóstico. En nuestra opinión, lo decisivo en los tres fue poner a todos los actores bajo una misma dirección institucional, más que la tecnología o una ley aislada. En Inglaterra, Hillsborough obligó a coordinar a actores que antes actuaban por separado, y Dunning (1999) sostiene que el cambio cultural en las gradas, que volvió la violencia algo mal visto socialmente, pesó tanto como la reforma física de los estadios, porque atacó la causa y no solo el síntoma. Argentina y Uruguay, en cambio, no esperaron una tragedia semejante: allí el cambio vino de una decisión política sostenida en el tiempo pese a las resistencias, y en ambos casos se apoyó en identificar a quien entra al estadio. En Colombia, por lo que muestran las fuentes y los casos, la respuesta visible se ha quedado en multas disciplinarias a los clubes y en operativos de policía, y la identificación de asistentes nunca llegó a funcionar de forma general, como lo prueban el fracaso de la carnetización y el caso 1.</w:t>
+        <w:t>Lo que muestran los otros países aterriza el diagnóstico. En nuestra opinión, lo decisivo en los tres fue poner a todos los actores bajo una misma dirección institucional, más que la tecnología o una ley aislada. En Inglaterra, Hillsborough obligó a coordinar a actores que antes andaban cada uno por su lado, y Dunning (1999) sostiene que el cambio cultural en las gradas, que volvió la violencia algo mal visto socialmente, pesó tanto como la reforma física de los estadios, porque atacó la causa y no solo el síntoma. Argentina y Uruguay, en cambio, no esperaron una tragedia semejante: allí el cambio vino de una decisión política sostenida en el tiempo pese a las resistencias, y en ambos casos se apoyó en identificar a quien entra al estadio. En Colombia, por lo que muestran las fuentes y los casos, la respuesta visible se ha quedado en multas disciplinarias a los clubes y en operativos de policía, y la identificación de asistentes nunca llegó a funcionar de forma general, como lo prueban el fracaso de la carnetización y el caso 1.</w:t>
       </w:r>
     </w:p>
     <w:p>
@@ -7489,7 +7489,7 @@
       </w:pPr>
       <w:r>
         <w:rPr/>
-        <w:t>Mirados desde la sociología del deporte, estos resultados dialogan con la tesis de Clavijo (2004), que ve en las barras un espacio donde se incluyen jóvenes excluidos. Si eso es cierto, la represión indiscriminada produce pocos resultados y, a veces, resulta contraproducente. Quitar los espacios de identidad colectiva no hace desaparecer las energías sociales que la barra canaliza; esas energías buscan otra salida, que puede ser peor. Una política mal diseñada, además, tiende a mezclar dos cosas distintas. Para el integrante violento están la sanción penal y la exclusión del estadio. Para la barra como institución social, los proyectos de intervención cultural y los programas de inclusión, empleo y ocupación. En Inglaterra, los programas comunitarios que los clubes desarrollan desde finales de los noventa sugieren que la cultura de las tribunas puede cambiar sin criminalizar a toda la hinchada.</w:t>
+        <w:t>Mirados desde la sociología del deporte, estos resultados dialogan con la tesis de Clavijo (2004), que ve en las barras un espacio donde se incluyen jóvenes excluidos. Si eso es cierto, la represión indiscriminada rinde poco, y a veces sale contraproducente. Quitar los espacios de identidad colectiva no hace desaparecer las energías sociales que la barra canaliza; esas energías buscan otra salida, que puede ser peor. Una política mal diseñada, además, tiende a mezclar dos cosas distintas. Para el integrante violento están la sanción penal y la exclusión del estadio. Para la barra como institución social, los proyectos de intervención cultural y los programas de inclusión, empleo y ocupación. En Inglaterra, los programas comunitarios que los clubes desarrollan desde finales de los noventa sugieren que la cultura de las tribunas puede cambiar sin criminalizar a toda la hinchada.</w:t>
       </w:r>
     </w:p>
     <w:p>
@@ -7524,7 +7524,7 @@
       </w:pPr>
       <w:r>
         <w:rPr/>
-        <w:t>La evolución más reciente del modelo argentino brinda una enseñanza de implicaciones contradictorias que conviene recoger. Mediante la Resolución 429 de 2026, del 13 de mayo de 2026, publicada en el Boletín Oficial, se modificó el artículo 2 de la Resolución 354 de 2017 y se amplió la restricción de concurrencia administrativa a quien esté inscrito en “Registros Públicos de Alimentantes Morosos, o su equivalente, conforme a la normativa local” (Ministerio de Seguridad Nacional, 2026b, art. 1, literal h). Esa medida, que se articula con la Ley 269 de la Ciudad de Buenos Aires y con la Ley 7411 de Salta, termina usando el acceso al estadio como presión para que se paguen las cuotas alimentarias. Nos parece que eso muestra la fuerza de un sistema de identificación ya consolidado, pero también abre dudas de proporcionalidad, porque el espectáculo deportivo se vuelve una herramienta para hacer cumplir deberes que nada tienen que ver con la seguridad, y es una discusión que Colombia tendrá que dar si llega a adoptar un mecanismo parecido.</w:t>
+        <w:t>La evolución más reciente del modelo argentino brinda una enseñanza de implicaciones contradictorias que conviene recoger. Mediante la Resolución 429 de 2026, del 13 de mayo de 2026, publicada en el Boletín Oficial, se modificó el artículo 2 de la Resolución 354 de 2017 y se amplió la restricción de concurrencia administrativa a quien esté inscrito en “Registros Públicos de Alimentantes Morosos, o su equivalente, conforme a la normativa local” (Ministerio de Seguridad Nacional, 2026b, art. 1, literal h). Esa medida, que se articula con la Ley 269 de la Ciudad de Buenos Aires y con la Ley 7411 de Salta, termina usando el acceso al estadio como presión para que se paguen las cuotas alimentarias. Nos parece que eso muestra la fuerza de un sistema de identificación ya consolidado, pero también abre dudas de proporcionalidad, porque el espectáculo deportivo se vuelve una herramienta para hacer cumplir deberes que nada tienen que ver con la seguridad, y es una discusión que Colombia tendrá que dar si llega a montar un mecanismo parecido.</w:t>
       </w:r>
     </w:p>
     <w:p>

</xml_diff>